<commit_message>
Add 18-page PDF project report with app screenshots
- src/build_pdf.py builds reports/PriceScope_Project_Report.pdf
- src/capture_screenshots.py captures the app with Playwright
- src/report_figures.py adds per-city maps and hold-out error analysis
- Correct the duplicated-listing count to 18,774 in REPORT.md

Co-Authored-By: Claude Opus 5.5 <noreply@anthropic.com>
</commit_message>
<xml_diff>
--- a/reports/REPORT.docx
+++ b/reports/REPORT.docx
@@ -1478,13 +1478,13 @@
         <w:t>A finding that matters for evaluation:</w:t>
       </w:r>
       <w:r>
-        <w:t xml:space="preserve"> about </w:t>
+        <w:t xml:space="preserve"> </w:t>
       </w:r>
       <w:r>
         <w:rPr>
           <w:b/>
         </w:rPr>
-        <w:t>10,800 listings appear twice</w:t>
+        <w:t>18,774 listings appear twice</w:t>
       </w:r>
       <w:r>
         <w:t xml:space="preserve">, once as a weekday row and once as a weekend row, with almost the same price. A random train/test split would put one copy in training and the other in testing, so the model would be scored partly on listings it had already seen. We give every row a </w:t>

</xml_diff>

<commit_message>
Add Route Planner: Dijkstra, Bellman-Ford and TSP over chosen listings
- src/algorithms.py: k-NN graph, Dijkstra (binary heap), Bellman-Ford with
  negative-cycle check, Held-Karp exact TSP, nearest neighbour + 2-opt
- /route page and POST /api/route: pick listings on the map, compare
  results, operation counts and run times
- tests/test_algorithms.py: 11 tests against Floyd-Warshall and brute force

Co-Authored-By: Claude Opus 5.5 <noreply@anthropic.com>
</commit_message>
<xml_diff>
--- a/reports/REPORT.docx
+++ b/reports/REPORT.docx
@@ -4835,6 +4835,48 @@
                 <w:b/>
                 <w:sz w:val="18"/>
               </w:rPr>
+              <w:t>Route Planner</w:t>
+            </w:r>
+          </w:p>
+        </w:tc>
+        <w:tc>
+          <w:tcPr>
+            <w:tcW w:type="dxa" w:w="4320"/>
+          </w:tcPr>
+          <w:p>
+            <w:r>
+              <w:rPr>
+                <w:b w:val="0"/>
+                <w:sz w:val="18"/>
+              </w:rPr>
+            </w:r>
+            <w:r>
+              <w:rPr>
+                <w:b w:val="0"/>
+                <w:sz w:val="18"/>
+              </w:rPr>
+              <w:t>select the listings to visit on a city map. Shortest paths by Dijkstra and Bellman-Ford, and the best visiting order by the Travelling Salesman algorithms (section 7.1)</w:t>
+            </w:r>
+          </w:p>
+        </w:tc>
+      </w:tr>
+      <w:tr>
+        <w:tc>
+          <w:tcPr>
+            <w:tcW w:type="dxa" w:w="4320"/>
+          </w:tcPr>
+          <w:p>
+            <w:r>
+              <w:rPr>
+                <w:b w:val="0"/>
+                <w:sz w:val="18"/>
+              </w:rPr>
+            </w:r>
+            <w:r>
+              <w:rPr>
+                <w:b/>
+                <w:sz w:val="18"/>
+              </w:rPr>
               <w:t>Model Performance</w:t>
             </w:r>
           </w:p>
@@ -4951,6 +4993,16 @@
           <w:rFonts w:ascii="Consolas" w:hAnsi="Consolas"/>
           <w:sz w:val="19"/>
         </w:rPr>
+        <w:t>POST /api/route</w:t>
+      </w:r>
+      <w:r>
+        <w:t xml:space="preserve">, </w:t>
+      </w:r>
+      <w:r>
+        <w:rPr>
+          <w:rFonts w:ascii="Consolas" w:hAnsi="Consolas"/>
+          <w:sz w:val="19"/>
+        </w:rPr>
         <w:t>GET /api/listings/&lt;city&gt;</w:t>
       </w:r>
       <w:r>
@@ -4965,6 +5017,643 @@
       </w:r>
       <w:r>
         <w:t>.</w:t>
+      </w:r>
+    </w:p>
+    <w:p>
+      <w:pPr>
+        <w:pStyle w:val="Heading2"/>
+      </w:pPr>
+      <w:r>
+        <w:t>7.1 Route Planner (Design and Analysis of Algorithms)</w:t>
+      </w:r>
+    </w:p>
+    <w:p>
+      <w:r>
+        <w:t xml:space="preserve">The user clicks up to 20 listings on the map and marks one as the start. </w:t>
+      </w:r>
+      <w:r>
+        <w:rPr>
+          <w:rFonts w:ascii="Consolas" w:hAnsi="Consolas"/>
+          <w:sz w:val="19"/>
+        </w:rPr>
+        <w:t>src/algorithms.py</w:t>
+      </w:r>
+      <w:r>
+        <w:t xml:space="preserve"> implements every algorithm from scratch in plain Python:</w:t>
+      </w:r>
+    </w:p>
+    <w:tbl>
+      <w:tblPr>
+        <w:tblStyle w:val="LightGrid-Accent1"/>
+        <w:tblW w:type="auto" w:w="0"/>
+        <w:tblLook w:firstColumn="1" w:firstRow="1" w:lastColumn="0" w:lastRow="0" w:noHBand="0" w:noVBand="1" w:val="04A0"/>
+      </w:tblPr>
+      <w:tblGrid>
+        <w:gridCol w:w="2160"/>
+        <w:gridCol w:w="2160"/>
+        <w:gridCol w:w="2160"/>
+        <w:gridCol w:w="2160"/>
+      </w:tblGrid>
+      <w:tr>
+        <w:tc>
+          <w:tcPr>
+            <w:tcW w:type="dxa" w:w="2160"/>
+          </w:tcPr>
+          <w:p>
+            <w:r>
+              <w:rPr>
+                <w:b/>
+                <w:sz w:val="18"/>
+              </w:rPr>
+            </w:r>
+            <w:r>
+              <w:rPr>
+                <w:b/>
+                <w:sz w:val="18"/>
+              </w:rPr>
+              <w:t>Algorithm</w:t>
+            </w:r>
+          </w:p>
+        </w:tc>
+        <w:tc>
+          <w:tcPr>
+            <w:tcW w:type="dxa" w:w="2160"/>
+          </w:tcPr>
+          <w:p>
+            <w:r>
+              <w:rPr>
+                <w:b/>
+                <w:sz w:val="18"/>
+              </w:rPr>
+            </w:r>
+            <w:r>
+              <w:rPr>
+                <w:b/>
+                <w:sz w:val="18"/>
+              </w:rPr>
+              <w:t>Problem solved</w:t>
+            </w:r>
+          </w:p>
+        </w:tc>
+        <w:tc>
+          <w:tcPr>
+            <w:tcW w:type="dxa" w:w="2160"/>
+          </w:tcPr>
+          <w:p>
+            <w:r>
+              <w:rPr>
+                <w:b/>
+                <w:sz w:val="18"/>
+              </w:rPr>
+            </w:r>
+            <w:r>
+              <w:rPr>
+                <w:b/>
+                <w:sz w:val="18"/>
+              </w:rPr>
+              <w:t>Time complexity</w:t>
+            </w:r>
+          </w:p>
+        </w:tc>
+        <w:tc>
+          <w:tcPr>
+            <w:tcW w:type="dxa" w:w="2160"/>
+          </w:tcPr>
+          <w:p>
+            <w:r>
+              <w:rPr>
+                <w:b/>
+                <w:sz w:val="18"/>
+              </w:rPr>
+            </w:r>
+            <w:r>
+              <w:rPr>
+                <w:b/>
+                <w:sz w:val="18"/>
+              </w:rPr>
+              <w:t>Notes</w:t>
+            </w:r>
+          </w:p>
+        </w:tc>
+      </w:tr>
+      <w:tr>
+        <w:tc>
+          <w:tcPr>
+            <w:tcW w:type="dxa" w:w="2160"/>
+          </w:tcPr>
+          <w:p>
+            <w:r>
+              <w:rPr>
+                <w:b w:val="0"/>
+                <w:sz w:val="18"/>
+              </w:rPr>
+            </w:r>
+            <w:r>
+              <w:rPr>
+                <w:b w:val="0"/>
+                <w:sz w:val="18"/>
+              </w:rPr>
+              <w:t>k-nearest-neighbour graph</w:t>
+            </w:r>
+          </w:p>
+        </w:tc>
+        <w:tc>
+          <w:tcPr>
+            <w:tcW w:type="dxa" w:w="2160"/>
+          </w:tcPr>
+          <w:p>
+            <w:r>
+              <w:rPr>
+                <w:b w:val="0"/>
+                <w:sz w:val="18"/>
+              </w:rPr>
+            </w:r>
+            <w:r>
+              <w:rPr>
+                <w:b w:val="0"/>
+                <w:sz w:val="18"/>
+              </w:rPr>
+              <w:t>builds the network</w:t>
+            </w:r>
+          </w:p>
+        </w:tc>
+        <w:tc>
+          <w:tcPr>
+            <w:tcW w:type="dxa" w:w="2160"/>
+          </w:tcPr>
+          <w:p>
+            <w:r>
+              <w:rPr>
+                <w:b w:val="0"/>
+                <w:sz w:val="18"/>
+              </w:rPr>
+            </w:r>
+            <w:r>
+              <w:rPr>
+                <w:b w:val="0"/>
+                <w:sz w:val="18"/>
+              </w:rPr>
+              <w:t>O(V² log V)</w:t>
+            </w:r>
+          </w:p>
+        </w:tc>
+        <w:tc>
+          <w:tcPr>
+            <w:tcW w:type="dxa" w:w="2160"/>
+          </w:tcPr>
+          <w:p>
+            <w:r>
+              <w:rPr>
+                <w:b w:val="0"/>
+                <w:sz w:val="18"/>
+              </w:rPr>
+            </w:r>
+            <w:r>
+              <w:rPr>
+                <w:b w:val="0"/>
+                <w:sz w:val="18"/>
+              </w:rPr>
+              <w:t>each stop is linked to its k nearest stops (haversine km); components are joined by DFS until connected</w:t>
+            </w:r>
+          </w:p>
+        </w:tc>
+      </w:tr>
+      <w:tr>
+        <w:tc>
+          <w:tcPr>
+            <w:tcW w:type="dxa" w:w="2160"/>
+          </w:tcPr>
+          <w:p>
+            <w:r>
+              <w:rPr>
+                <w:b w:val="0"/>
+                <w:sz w:val="18"/>
+              </w:rPr>
+            </w:r>
+            <w:r>
+              <w:rPr>
+                <w:b w:val="0"/>
+                <w:sz w:val="18"/>
+              </w:rPr>
+              <w:t>Dijkstra</w:t>
+            </w:r>
+          </w:p>
+        </w:tc>
+        <w:tc>
+          <w:tcPr>
+            <w:tcW w:type="dxa" w:w="2160"/>
+          </w:tcPr>
+          <w:p>
+            <w:r>
+              <w:rPr>
+                <w:b w:val="0"/>
+                <w:sz w:val="18"/>
+              </w:rPr>
+            </w:r>
+            <w:r>
+              <w:rPr>
+                <w:b w:val="0"/>
+                <w:sz w:val="18"/>
+              </w:rPr>
+              <w:t>shortest path from the start to every stop</w:t>
+            </w:r>
+          </w:p>
+        </w:tc>
+        <w:tc>
+          <w:tcPr>
+            <w:tcW w:type="dxa" w:w="2160"/>
+          </w:tcPr>
+          <w:p>
+            <w:r>
+              <w:rPr>
+                <w:b w:val="0"/>
+                <w:sz w:val="18"/>
+              </w:rPr>
+            </w:r>
+            <w:r>
+              <w:rPr>
+                <w:b w:val="0"/>
+                <w:sz w:val="18"/>
+              </w:rPr>
+              <w:t>O((V + E) log V)</w:t>
+            </w:r>
+          </w:p>
+        </w:tc>
+        <w:tc>
+          <w:tcPr>
+            <w:tcW w:type="dxa" w:w="2160"/>
+          </w:tcPr>
+          <w:p>
+            <w:r>
+              <w:rPr>
+                <w:b w:val="0"/>
+                <w:sz w:val="18"/>
+              </w:rPr>
+            </w:r>
+            <w:r>
+              <w:rPr>
+                <w:b w:val="0"/>
+                <w:sz w:val="18"/>
+              </w:rPr>
+              <w:t>binary min-heap with lazy deletion; needs non-negative weights</w:t>
+            </w:r>
+          </w:p>
+        </w:tc>
+      </w:tr>
+      <w:tr>
+        <w:tc>
+          <w:tcPr>
+            <w:tcW w:type="dxa" w:w="2160"/>
+          </w:tcPr>
+          <w:p>
+            <w:r>
+              <w:rPr>
+                <w:b w:val="0"/>
+                <w:sz w:val="18"/>
+              </w:rPr>
+            </w:r>
+            <w:r>
+              <w:rPr>
+                <w:b w:val="0"/>
+                <w:sz w:val="18"/>
+              </w:rPr>
+              <w:t>Bellman-Ford</w:t>
+            </w:r>
+          </w:p>
+        </w:tc>
+        <w:tc>
+          <w:tcPr>
+            <w:tcW w:type="dxa" w:w="2160"/>
+          </w:tcPr>
+          <w:p>
+            <w:r>
+              <w:rPr>
+                <w:b w:val="0"/>
+                <w:sz w:val="18"/>
+              </w:rPr>
+            </w:r>
+            <w:r>
+              <w:rPr>
+                <w:b w:val="0"/>
+                <w:sz w:val="18"/>
+              </w:rPr>
+              <w:t>the same, by edge relaxation</w:t>
+            </w:r>
+          </w:p>
+        </w:tc>
+        <w:tc>
+          <w:tcPr>
+            <w:tcW w:type="dxa" w:w="2160"/>
+          </w:tcPr>
+          <w:p>
+            <w:r>
+              <w:rPr>
+                <w:b w:val="0"/>
+                <w:sz w:val="18"/>
+              </w:rPr>
+            </w:r>
+            <w:r>
+              <w:rPr>
+                <w:b w:val="0"/>
+                <w:sz w:val="18"/>
+              </w:rPr>
+              <w:t>O(V · E)</w:t>
+            </w:r>
+          </w:p>
+        </w:tc>
+        <w:tc>
+          <w:tcPr>
+            <w:tcW w:type="dxa" w:w="2160"/>
+          </w:tcPr>
+          <w:p>
+            <w:r>
+              <w:rPr>
+                <w:b w:val="0"/>
+                <w:sz w:val="18"/>
+              </w:rPr>
+            </w:r>
+            <w:r>
+              <w:rPr>
+                <w:b w:val="0"/>
+                <w:sz w:val="18"/>
+              </w:rPr>
+              <w:t>at most V−1 passes with early exit, then one extra pass for negative-cycle detection</w:t>
+            </w:r>
+          </w:p>
+        </w:tc>
+      </w:tr>
+      <w:tr>
+        <w:tc>
+          <w:tcPr>
+            <w:tcW w:type="dxa" w:w="2160"/>
+          </w:tcPr>
+          <w:p>
+            <w:r>
+              <w:rPr>
+                <w:b w:val="0"/>
+                <w:sz w:val="18"/>
+              </w:rPr>
+            </w:r>
+            <w:r>
+              <w:rPr>
+                <w:b w:val="0"/>
+                <w:sz w:val="18"/>
+              </w:rPr>
+              <w:t>All-pairs Dijkstra</w:t>
+            </w:r>
+          </w:p>
+        </w:tc>
+        <w:tc>
+          <w:tcPr>
+            <w:tcW w:type="dxa" w:w="2160"/>
+          </w:tcPr>
+          <w:p>
+            <w:r>
+              <w:rPr>
+                <w:b w:val="0"/>
+                <w:sz w:val="18"/>
+              </w:rPr>
+            </w:r>
+            <w:r>
+              <w:rPr>
+                <w:b w:val="0"/>
+                <w:sz w:val="18"/>
+              </w:rPr>
+              <w:t>distance matrix for the TSP</w:t>
+            </w:r>
+          </w:p>
+        </w:tc>
+        <w:tc>
+          <w:tcPr>
+            <w:tcW w:type="dxa" w:w="2160"/>
+          </w:tcPr>
+          <w:p>
+            <w:r>
+              <w:rPr>
+                <w:b w:val="0"/>
+                <w:sz w:val="18"/>
+              </w:rPr>
+            </w:r>
+            <w:r>
+              <w:rPr>
+                <w:b w:val="0"/>
+                <w:sz w:val="18"/>
+              </w:rPr>
+              <w:t>O(V (V + E) log V)</w:t>
+            </w:r>
+          </w:p>
+        </w:tc>
+        <w:tc>
+          <w:tcPr>
+            <w:tcW w:type="dxa" w:w="2160"/>
+          </w:tcPr>
+          <w:p>
+            <w:r>
+              <w:rPr>
+                <w:b w:val="0"/>
+                <w:sz w:val="18"/>
+              </w:rPr>
+            </w:r>
+            <w:r>
+              <w:rPr>
+                <w:b w:val="0"/>
+                <w:sz w:val="18"/>
+              </w:rPr>
+              <w:t>the TSP runs on graph distances, so each leg follows a real shortest path</w:t>
+            </w:r>
+          </w:p>
+        </w:tc>
+      </w:tr>
+      <w:tr>
+        <w:tc>
+          <w:tcPr>
+            <w:tcW w:type="dxa" w:w="2160"/>
+          </w:tcPr>
+          <w:p>
+            <w:r>
+              <w:rPr>
+                <w:b w:val="0"/>
+                <w:sz w:val="18"/>
+              </w:rPr>
+            </w:r>
+            <w:r>
+              <w:rPr>
+                <w:b w:val="0"/>
+                <w:sz w:val="18"/>
+              </w:rPr>
+              <w:t>Held-Karp</w:t>
+            </w:r>
+          </w:p>
+        </w:tc>
+        <w:tc>
+          <w:tcPr>
+            <w:tcW w:type="dxa" w:w="2160"/>
+          </w:tcPr>
+          <w:p>
+            <w:r>
+              <w:rPr>
+                <w:b w:val="0"/>
+                <w:sz w:val="18"/>
+              </w:rPr>
+            </w:r>
+            <w:r>
+              <w:rPr>
+                <w:b w:val="0"/>
+                <w:sz w:val="18"/>
+              </w:rPr>
+              <w:t>exact Travelling Salesman tour</w:t>
+            </w:r>
+          </w:p>
+        </w:tc>
+        <w:tc>
+          <w:tcPr>
+            <w:tcW w:type="dxa" w:w="2160"/>
+          </w:tcPr>
+          <w:p>
+            <w:r>
+              <w:rPr>
+                <w:b w:val="0"/>
+                <w:sz w:val="18"/>
+              </w:rPr>
+            </w:r>
+            <w:r>
+              <w:rPr>
+                <w:b w:val="0"/>
+                <w:sz w:val="18"/>
+              </w:rPr>
+              <w:t>O(n² · 2ⁿ) time, O(n · 2ⁿ) memory</w:t>
+            </w:r>
+          </w:p>
+        </w:tc>
+        <w:tc>
+          <w:tcPr>
+            <w:tcW w:type="dxa" w:w="2160"/>
+          </w:tcPr>
+          <w:p>
+            <w:r>
+              <w:rPr>
+                <w:b w:val="0"/>
+                <w:sz w:val="18"/>
+              </w:rPr>
+            </w:r>
+            <w:r>
+              <w:rPr>
+                <w:b w:val="0"/>
+                <w:sz w:val="18"/>
+              </w:rPr>
+              <w:t>bitmask dynamic programming; used for up to 12 stops</w:t>
+            </w:r>
+          </w:p>
+        </w:tc>
+      </w:tr>
+      <w:tr>
+        <w:tc>
+          <w:tcPr>
+            <w:tcW w:type="dxa" w:w="2160"/>
+          </w:tcPr>
+          <w:p>
+            <w:r>
+              <w:rPr>
+                <w:b w:val="0"/>
+                <w:sz w:val="18"/>
+              </w:rPr>
+            </w:r>
+            <w:r>
+              <w:rPr>
+                <w:b w:val="0"/>
+                <w:sz w:val="18"/>
+              </w:rPr>
+              <w:t>Nearest neighbour + 2-opt</w:t>
+            </w:r>
+          </w:p>
+        </w:tc>
+        <w:tc>
+          <w:tcPr>
+            <w:tcW w:type="dxa" w:w="2160"/>
+          </w:tcPr>
+          <w:p>
+            <w:r>
+              <w:rPr>
+                <w:b w:val="0"/>
+                <w:sz w:val="18"/>
+              </w:rPr>
+            </w:r>
+            <w:r>
+              <w:rPr>
+                <w:b w:val="0"/>
+                <w:sz w:val="18"/>
+              </w:rPr>
+              <w:t>heuristic Travelling Salesman tour</w:t>
+            </w:r>
+          </w:p>
+        </w:tc>
+        <w:tc>
+          <w:tcPr>
+            <w:tcW w:type="dxa" w:w="2160"/>
+          </w:tcPr>
+          <w:p>
+            <w:r>
+              <w:rPr>
+                <w:b w:val="0"/>
+                <w:sz w:val="18"/>
+              </w:rPr>
+            </w:r>
+            <w:r>
+              <w:rPr>
+                <w:b w:val="0"/>
+                <w:sz w:val="18"/>
+              </w:rPr>
+              <w:t>O(n²) per 2-opt pass</w:t>
+            </w:r>
+          </w:p>
+        </w:tc>
+        <w:tc>
+          <w:tcPr>
+            <w:tcW w:type="dxa" w:w="2160"/>
+          </w:tcPr>
+          <w:p>
+            <w:r>
+              <w:rPr>
+                <w:b w:val="0"/>
+                <w:sz w:val="18"/>
+              </w:rPr>
+            </w:r>
+            <w:r>
+              <w:rPr>
+                <w:b w:val="0"/>
+                <w:sz w:val="18"/>
+              </w:rPr>
+              <w:t>greedy tour, then segment reversals while they shorten it</w:t>
+            </w:r>
+          </w:p>
+        </w:tc>
+      </w:tr>
+    </w:tbl>
+    <w:p/>
+    <w:p>
+      <w:r>
+        <w:t>The page shows each algorithm's result, path or tour, operation counts (edge relaxations, heap pushes, Bellman-Ford passes, DP transitions, 2-opt swaps) and run time, together with the gap between the heuristic and the exact optimum. It also checks that Dijkstra and Bellman-Ford give identical distances to every stop, and shows the all-pairs distance matrix.</w:t>
+      </w:r>
+    </w:p>
+    <w:p>
+      <w:r>
+        <w:rPr>
+          <w:b/>
+        </w:rPr>
+        <w:t>Correctness tests</w:t>
+      </w:r>
+      <w:r>
+        <w:t xml:space="preserve"> (</w:t>
+      </w:r>
+      <w:r>
+        <w:rPr>
+          <w:rFonts w:ascii="Consolas" w:hAnsi="Consolas"/>
+          <w:sz w:val="19"/>
+        </w:rPr>
+        <w:t>python -m unittest discover tests</w:t>
+      </w:r>
+      <w:r>
+        <w:t>, 11 tests): Dijkstra and Bellman-Ford against Floyd-Warshall on 30 random graphs, a hand-worked example, negative edges and negative-cycle detection for Bellman-Ford, Held-Karp against O(n!) brute force for 3–8 stops, the heuristic never beating the exact optimum, and tours visiting every stop exactly once.</w:t>
       </w:r>
     </w:p>
     <w:p>
@@ -5076,6 +5765,10 @@
         <w:t>src/train.py                step 3: training, evaluation, export</w:t>
         <w:br/>
         <w:t>src/predictor.py            inference service (location features, SHAP)</w:t>
+        <w:br/>
+        <w:t>src/algorithms.py           Dijkstra, Bellman-Ford, Held-Karp, 2-opt (Route Planner)</w:t>
+        <w:br/>
+        <w:t>tests/                      unit tests for the algorithms</w:t>
         <w:br/>
         <w:t>app.py                      Flask web app and REST API</w:t>
         <w:br/>

</xml_diff>

<commit_message>
Rename project to Altitude; split report into Python and DAA PDFs
- Rebrand the app, docs and launch config as Altitude, with a new
  mountain-peak logo
- src/pdf_common.py holds shared PDF layout and helpers
- src/report_python.py builds a 16-page Python report
- src/report_daa.py builds a 15-page DAA report with generated traces
- Remove the old combined report and its builder

Co-Authored-By: Claude Opus 5.5 <noreply@anthropic.com>
</commit_message>
<xml_diff>
--- a/reports/REPORT.docx
+++ b/reports/REPORT.docx
@@ -21,7 +21,7 @@
         <w:t>Project report:</w:t>
       </w:r>
       <w:r>
-        <w:t xml:space="preserve"> data cleaning, exploratory analysis, machine-learning modelling and deployment as a web app (PriceScope).</w:t>
+        <w:t xml:space="preserve"> data cleaning, exploratory analysis, machine-learning modelling and deployment as a web app (Altitude).</w:t>
       </w:r>
     </w:p>
     <w:p>
@@ -4637,7 +4637,7 @@
         <w:pStyle w:val="Heading1"/>
       </w:pPr>
       <w:r>
-        <w:t>7. The web application (PriceScope)</w:t>
+        <w:t>7. The web application (Altitude)</w:t>
       </w:r>
     </w:p>
     <w:tbl>

</xml_diff>